<commit_message>
added files world and pdf
</commit_message>
<xml_diff>
--- a/TUGAS PROYEK DDP.docx
+++ b/TUGAS PROYEK DDP.docx
@@ -21,7 +21,67 @@
           <w:sz w:val="32"/>
           <w:szCs w:val="32"/>
         </w:rPr>
-        <w:t>TUGAS PROYEK DDP</w:t>
+        <w:t xml:space="preserve">TUGAS PROYEK </w:t>
+      </w:r>
+      <w:r>
+        <w:rPr>
+          <w:rFonts w:ascii="Times New Roman" w:hAnsi="Times New Roman" w:cs="Times New Roman"/>
+          <w:b/>
+          <w:bCs/>
+          <w:sz w:val="32"/>
+          <w:szCs w:val="32"/>
+        </w:rPr>
+        <w:t>D</w:t>
+      </w:r>
+      <w:r>
+        <w:rPr>
+          <w:rFonts w:ascii="Times New Roman" w:hAnsi="Times New Roman" w:cs="Times New Roman"/>
+          <w:b/>
+          <w:bCs/>
+          <w:sz w:val="32"/>
+          <w:szCs w:val="32"/>
+        </w:rPr>
+        <w:t xml:space="preserve">ASAR </w:t>
+      </w:r>
+      <w:r>
+        <w:rPr>
+          <w:rFonts w:ascii="Times New Roman" w:hAnsi="Times New Roman" w:cs="Times New Roman"/>
+          <w:b/>
+          <w:bCs/>
+          <w:sz w:val="32"/>
+          <w:szCs w:val="32"/>
+        </w:rPr>
+        <w:t>D</w:t>
+      </w:r>
+      <w:r>
+        <w:rPr>
+          <w:rFonts w:ascii="Times New Roman" w:hAnsi="Times New Roman" w:cs="Times New Roman"/>
+          <w:b/>
+          <w:bCs/>
+          <w:sz w:val="32"/>
+          <w:szCs w:val="32"/>
+        </w:rPr>
+        <w:t xml:space="preserve">ASAR </w:t>
+      </w:r>
+      <w:r>
+        <w:rPr>
+          <w:rFonts w:ascii="Times New Roman" w:hAnsi="Times New Roman" w:cs="Times New Roman"/>
+          <w:b/>
+          <w:bCs/>
+          <w:sz w:val="32"/>
+          <w:szCs w:val="32"/>
+        </w:rPr>
+        <w:t>P</w:t>
+      </w:r>
+      <w:r>
+        <w:rPr>
+          <w:rFonts w:ascii="Times New Roman" w:hAnsi="Times New Roman" w:cs="Times New Roman"/>
+          <w:b/>
+          <w:bCs/>
+          <w:sz w:val="32"/>
+          <w:szCs w:val="32"/>
+        </w:rPr>
+        <w:t>EMROGRAMMAN</w:t>
       </w:r>
     </w:p>
     <w:p>
@@ -243,13 +303,9 @@
           <w:sz w:val="24"/>
           <w:szCs w:val="24"/>
         </w:rPr>
-        <w:t>ARILE NARI</w:t>
-      </w:r>
-    </w:p>
-    <w:p>
-      <w:pPr>
-        <w:spacing w:before="0" w:line="240" w:lineRule="auto"/>
-        <w:ind w:left="0"/>
+        <w:t>ARIL</w:t>
+      </w:r>
+      <w:r>
         <w:rPr>
           <w:rFonts w:ascii="Times New Roman" w:hAnsi="Times New Roman" w:cs="Times New Roman"/>
           <w:b/>
@@ -257,7 +313,8 @@
           <w:sz w:val="24"/>
           <w:szCs w:val="24"/>
         </w:rPr>
-      </w:pPr>
+        <w:t xml:space="preserve"> </w:t>
+      </w:r>
       <w:r>
         <w:rPr>
           <w:rFonts w:ascii="Times New Roman" w:hAnsi="Times New Roman" w:cs="Times New Roman"/>
@@ -266,7 +323,50 @@
           <w:sz w:val="24"/>
           <w:szCs w:val="24"/>
         </w:rPr>
-        <w:t>JURUSAN SISTEM INFORMASI</w:t>
+        <w:t>NARI</w:t>
+      </w:r>
+    </w:p>
+    <w:p>
+      <w:pPr>
+        <w:spacing w:before="0" w:line="240" w:lineRule="auto"/>
+        <w:ind w:left="0"/>
+        <w:rPr>
+          <w:rFonts w:ascii="Times New Roman" w:hAnsi="Times New Roman" w:cs="Times New Roman"/>
+          <w:b/>
+          <w:bCs/>
+          <w:sz w:val="24"/>
+          <w:szCs w:val="24"/>
+        </w:rPr>
+      </w:pPr>
+      <w:r>
+        <w:rPr>
+          <w:rFonts w:ascii="Times New Roman" w:hAnsi="Times New Roman" w:cs="Times New Roman"/>
+          <w:b/>
+          <w:bCs/>
+          <w:sz w:val="24"/>
+          <w:szCs w:val="24"/>
+        </w:rPr>
+        <w:t xml:space="preserve">JURUSAN </w:t>
+      </w:r>
+      <w:r>
+        <w:rPr>
+          <w:rFonts w:ascii="Times New Roman" w:hAnsi="Times New Roman" w:cs="Times New Roman"/>
+          <w:b/>
+          <w:bCs/>
+          <w:sz w:val="24"/>
+          <w:szCs w:val="24"/>
+        </w:rPr>
+        <w:t xml:space="preserve">: </w:t>
+      </w:r>
+      <w:r>
+        <w:rPr>
+          <w:rFonts w:ascii="Times New Roman" w:hAnsi="Times New Roman" w:cs="Times New Roman"/>
+          <w:b/>
+          <w:bCs/>
+          <w:sz w:val="24"/>
+          <w:szCs w:val="24"/>
+        </w:rPr>
+        <w:t>SISTEM INFORMASI</w:t>
       </w:r>
     </w:p>
     <w:p>
@@ -719,25 +819,7 @@
           <w:sz w:val="24"/>
           <w:szCs w:val="24"/>
         </w:rPr>
-        <w:t xml:space="preserve">procedure </w:t>
-      </w:r>
-      <w:proofErr w:type="gramStart"/>
-      <w:r>
-        <w:rPr>
-          <w:rFonts w:ascii="Times New Roman" w:hAnsi="Times New Roman" w:cs="Times New Roman"/>
-          <w:sz w:val="24"/>
-          <w:szCs w:val="24"/>
-        </w:rPr>
-        <w:t>StrukTransaksi(</w:t>
-      </w:r>
-      <w:proofErr w:type="gramEnd"/>
-      <w:r>
-        <w:rPr>
-          <w:rFonts w:ascii="Times New Roman" w:hAnsi="Times New Roman" w:cs="Times New Roman"/>
-          <w:sz w:val="24"/>
-          <w:szCs w:val="24"/>
-        </w:rPr>
-        <w:t>jenis: string; jumlah: longint);</w:t>
+        <w:t>procedure StrukTransaksi(jenis: string; jumlah: longint);</w:t>
       </w:r>
     </w:p>
     <w:p>
@@ -797,231 +879,87 @@
           <w:sz w:val="24"/>
           <w:szCs w:val="24"/>
         </w:rPr>
-        <w:t xml:space="preserve">  </w:t>
-      </w:r>
-      <w:proofErr w:type="gramStart"/>
-      <w:r>
-        <w:rPr>
-          <w:rFonts w:ascii="Times New Roman" w:hAnsi="Times New Roman" w:cs="Times New Roman"/>
-          <w:sz w:val="24"/>
-          <w:szCs w:val="24"/>
-        </w:rPr>
-        <w:t>writeln(</w:t>
-      </w:r>
-      <w:proofErr w:type="gramEnd"/>
-      <w:r>
-        <w:rPr>
-          <w:rFonts w:ascii="Times New Roman" w:hAnsi="Times New Roman" w:cs="Times New Roman"/>
-          <w:sz w:val="24"/>
-          <w:szCs w:val="24"/>
-        </w:rPr>
-        <w:t>'===== STRUK TRANSAKSI =====');</w:t>
-      </w:r>
-    </w:p>
-    <w:p>
-      <w:pPr>
-        <w:spacing w:before="0" w:after="160"/>
-        <w:ind w:left="0"/>
-        <w:jc w:val="left"/>
-        <w:rPr>
-          <w:rFonts w:ascii="Times New Roman" w:hAnsi="Times New Roman" w:cs="Times New Roman"/>
-          <w:sz w:val="24"/>
-          <w:szCs w:val="24"/>
-        </w:rPr>
-      </w:pPr>
-      <w:r>
-        <w:rPr>
-          <w:rFonts w:ascii="Times New Roman" w:hAnsi="Times New Roman" w:cs="Times New Roman"/>
-          <w:sz w:val="24"/>
-          <w:szCs w:val="24"/>
-        </w:rPr>
-        <w:t xml:space="preserve">  </w:t>
-      </w:r>
-      <w:proofErr w:type="gramStart"/>
-      <w:r>
-        <w:rPr>
-          <w:rFonts w:ascii="Times New Roman" w:hAnsi="Times New Roman" w:cs="Times New Roman"/>
-          <w:sz w:val="24"/>
-          <w:szCs w:val="24"/>
-        </w:rPr>
-        <w:t>writeln(</w:t>
-      </w:r>
-      <w:proofErr w:type="gramEnd"/>
-      <w:r>
-        <w:rPr>
-          <w:rFonts w:ascii="Times New Roman" w:hAnsi="Times New Roman" w:cs="Times New Roman"/>
-          <w:sz w:val="24"/>
-          <w:szCs w:val="24"/>
-        </w:rPr>
-        <w:t xml:space="preserve">'Jenis </w:t>
-      </w:r>
-      <w:proofErr w:type="gramStart"/>
-      <w:r>
-        <w:rPr>
-          <w:rFonts w:ascii="Times New Roman" w:hAnsi="Times New Roman" w:cs="Times New Roman"/>
-          <w:sz w:val="24"/>
-          <w:szCs w:val="24"/>
-        </w:rPr>
-        <w:t>Transaksi :</w:t>
-      </w:r>
-      <w:proofErr w:type="gramEnd"/>
-      <w:r>
-        <w:rPr>
-          <w:rFonts w:ascii="Times New Roman" w:hAnsi="Times New Roman" w:cs="Times New Roman"/>
-          <w:sz w:val="24"/>
-          <w:szCs w:val="24"/>
-        </w:rPr>
-        <w:t xml:space="preserve"> ', jenis);</w:t>
-      </w:r>
-    </w:p>
-    <w:p>
-      <w:pPr>
-        <w:spacing w:before="0" w:after="160"/>
-        <w:ind w:left="0"/>
-        <w:jc w:val="left"/>
-        <w:rPr>
-          <w:rFonts w:ascii="Times New Roman" w:hAnsi="Times New Roman" w:cs="Times New Roman"/>
-          <w:sz w:val="24"/>
-          <w:szCs w:val="24"/>
-        </w:rPr>
-      </w:pPr>
-      <w:r>
-        <w:rPr>
-          <w:rFonts w:ascii="Times New Roman" w:hAnsi="Times New Roman" w:cs="Times New Roman"/>
-          <w:sz w:val="24"/>
-          <w:szCs w:val="24"/>
-        </w:rPr>
-        <w:t xml:space="preserve">  </w:t>
-      </w:r>
-      <w:proofErr w:type="gramStart"/>
-      <w:r>
-        <w:rPr>
-          <w:rFonts w:ascii="Times New Roman" w:hAnsi="Times New Roman" w:cs="Times New Roman"/>
-          <w:sz w:val="24"/>
-          <w:szCs w:val="24"/>
-        </w:rPr>
-        <w:t>writeln(</w:t>
-      </w:r>
-      <w:proofErr w:type="gramEnd"/>
-      <w:r>
-        <w:rPr>
-          <w:rFonts w:ascii="Times New Roman" w:hAnsi="Times New Roman" w:cs="Times New Roman"/>
-          <w:sz w:val="24"/>
-          <w:szCs w:val="24"/>
-        </w:rPr>
-        <w:t xml:space="preserve">'Jumlah        </w:t>
-      </w:r>
-      <w:proofErr w:type="gramStart"/>
-      <w:r>
-        <w:rPr>
-          <w:rFonts w:ascii="Times New Roman" w:hAnsi="Times New Roman" w:cs="Times New Roman"/>
-          <w:sz w:val="24"/>
-          <w:szCs w:val="24"/>
-        </w:rPr>
-        <w:t xml:space="preserve">  :</w:t>
-      </w:r>
-      <w:proofErr w:type="gramEnd"/>
-      <w:r>
-        <w:rPr>
-          <w:rFonts w:ascii="Times New Roman" w:hAnsi="Times New Roman" w:cs="Times New Roman"/>
-          <w:sz w:val="24"/>
-          <w:szCs w:val="24"/>
-        </w:rPr>
-        <w:t xml:space="preserve"> Rp ', jumlah);</w:t>
-      </w:r>
-    </w:p>
-    <w:p>
-      <w:pPr>
-        <w:spacing w:before="0" w:after="160"/>
-        <w:ind w:left="0"/>
-        <w:jc w:val="left"/>
-        <w:rPr>
-          <w:rFonts w:ascii="Times New Roman" w:hAnsi="Times New Roman" w:cs="Times New Roman"/>
-          <w:sz w:val="24"/>
-          <w:szCs w:val="24"/>
-        </w:rPr>
-      </w:pPr>
-      <w:r>
-        <w:rPr>
-          <w:rFonts w:ascii="Times New Roman" w:hAnsi="Times New Roman" w:cs="Times New Roman"/>
-          <w:sz w:val="24"/>
-          <w:szCs w:val="24"/>
-        </w:rPr>
-        <w:t xml:space="preserve">  </w:t>
-      </w:r>
-      <w:proofErr w:type="gramStart"/>
-      <w:r>
-        <w:rPr>
-          <w:rFonts w:ascii="Times New Roman" w:hAnsi="Times New Roman" w:cs="Times New Roman"/>
-          <w:sz w:val="24"/>
-          <w:szCs w:val="24"/>
-        </w:rPr>
-        <w:t>writeln(</w:t>
-      </w:r>
-      <w:proofErr w:type="gramEnd"/>
-      <w:r>
-        <w:rPr>
-          <w:rFonts w:ascii="Times New Roman" w:hAnsi="Times New Roman" w:cs="Times New Roman"/>
-          <w:sz w:val="24"/>
-          <w:szCs w:val="24"/>
-        </w:rPr>
-        <w:t xml:space="preserve">'Sisa Saldo    </w:t>
-      </w:r>
-      <w:proofErr w:type="gramStart"/>
-      <w:r>
-        <w:rPr>
-          <w:rFonts w:ascii="Times New Roman" w:hAnsi="Times New Roman" w:cs="Times New Roman"/>
-          <w:sz w:val="24"/>
-          <w:szCs w:val="24"/>
-        </w:rPr>
-        <w:t xml:space="preserve">  :</w:t>
-      </w:r>
-      <w:proofErr w:type="gramEnd"/>
-      <w:r>
-        <w:rPr>
-          <w:rFonts w:ascii="Times New Roman" w:hAnsi="Times New Roman" w:cs="Times New Roman"/>
-          <w:sz w:val="24"/>
-          <w:szCs w:val="24"/>
-        </w:rPr>
-        <w:t xml:space="preserve"> Rp ', saldo);</w:t>
-      </w:r>
-    </w:p>
-    <w:p>
-      <w:pPr>
-        <w:spacing w:before="0" w:after="160"/>
-        <w:ind w:left="0"/>
-        <w:jc w:val="left"/>
-        <w:rPr>
-          <w:rFonts w:ascii="Times New Roman" w:hAnsi="Times New Roman" w:cs="Times New Roman"/>
-          <w:sz w:val="24"/>
-          <w:szCs w:val="24"/>
-        </w:rPr>
-      </w:pPr>
-      <w:r>
-        <w:rPr>
-          <w:rFonts w:ascii="Times New Roman" w:hAnsi="Times New Roman" w:cs="Times New Roman"/>
-          <w:sz w:val="24"/>
-          <w:szCs w:val="24"/>
-        </w:rPr>
-        <w:t xml:space="preserve">  </w:t>
-      </w:r>
-      <w:proofErr w:type="gramStart"/>
-      <w:r>
-        <w:rPr>
-          <w:rFonts w:ascii="Times New Roman" w:hAnsi="Times New Roman" w:cs="Times New Roman"/>
-          <w:sz w:val="24"/>
-          <w:szCs w:val="24"/>
-        </w:rPr>
-        <w:t>writeln(</w:t>
-      </w:r>
-      <w:proofErr w:type="gramEnd"/>
-      <w:r>
-        <w:rPr>
-          <w:rFonts w:ascii="Times New Roman" w:hAnsi="Times New Roman" w:cs="Times New Roman"/>
-          <w:sz w:val="24"/>
-          <w:szCs w:val="24"/>
-        </w:rPr>
-        <w:t>'===========================');</w:t>
+        <w:t xml:space="preserve">  writeln('===== STRUK TRANSAKSI =====');</w:t>
+      </w:r>
+    </w:p>
+    <w:p>
+      <w:pPr>
+        <w:spacing w:before="0" w:after="160"/>
+        <w:ind w:left="0"/>
+        <w:jc w:val="left"/>
+        <w:rPr>
+          <w:rFonts w:ascii="Times New Roman" w:hAnsi="Times New Roman" w:cs="Times New Roman"/>
+          <w:sz w:val="24"/>
+          <w:szCs w:val="24"/>
+        </w:rPr>
+      </w:pPr>
+      <w:r>
+        <w:rPr>
+          <w:rFonts w:ascii="Times New Roman" w:hAnsi="Times New Roman" w:cs="Times New Roman"/>
+          <w:sz w:val="24"/>
+          <w:szCs w:val="24"/>
+        </w:rPr>
+        <w:t xml:space="preserve">  writeln('Jenis Transaksi : ', jenis);</w:t>
+      </w:r>
+    </w:p>
+    <w:p>
+      <w:pPr>
+        <w:spacing w:before="0" w:after="160"/>
+        <w:ind w:left="0"/>
+        <w:jc w:val="left"/>
+        <w:rPr>
+          <w:rFonts w:ascii="Times New Roman" w:hAnsi="Times New Roman" w:cs="Times New Roman"/>
+          <w:sz w:val="24"/>
+          <w:szCs w:val="24"/>
+        </w:rPr>
+      </w:pPr>
+      <w:r>
+        <w:rPr>
+          <w:rFonts w:ascii="Times New Roman" w:hAnsi="Times New Roman" w:cs="Times New Roman"/>
+          <w:sz w:val="24"/>
+          <w:szCs w:val="24"/>
+        </w:rPr>
+        <w:t xml:space="preserve">  writeln('Jumlah          : Rp ', jumlah);</w:t>
+      </w:r>
+    </w:p>
+    <w:p>
+      <w:pPr>
+        <w:spacing w:before="0" w:after="160"/>
+        <w:ind w:left="0"/>
+        <w:jc w:val="left"/>
+        <w:rPr>
+          <w:rFonts w:ascii="Times New Roman" w:hAnsi="Times New Roman" w:cs="Times New Roman"/>
+          <w:sz w:val="24"/>
+          <w:szCs w:val="24"/>
+        </w:rPr>
+      </w:pPr>
+      <w:r>
+        <w:rPr>
+          <w:rFonts w:ascii="Times New Roman" w:hAnsi="Times New Roman" w:cs="Times New Roman"/>
+          <w:sz w:val="24"/>
+          <w:szCs w:val="24"/>
+        </w:rPr>
+        <w:t xml:space="preserve">  writeln('Sisa Saldo      : Rp ', saldo);</w:t>
+      </w:r>
+    </w:p>
+    <w:p>
+      <w:pPr>
+        <w:spacing w:before="0" w:after="160"/>
+        <w:ind w:left="0"/>
+        <w:jc w:val="left"/>
+        <w:rPr>
+          <w:rFonts w:ascii="Times New Roman" w:hAnsi="Times New Roman" w:cs="Times New Roman"/>
+          <w:sz w:val="24"/>
+          <w:szCs w:val="24"/>
+        </w:rPr>
+      </w:pPr>
+      <w:r>
+        <w:rPr>
+          <w:rFonts w:ascii="Times New Roman" w:hAnsi="Times New Roman" w:cs="Times New Roman"/>
+          <w:sz w:val="24"/>
+          <w:szCs w:val="24"/>
+        </w:rPr>
+        <w:t xml:space="preserve">  writeln('===========================');</w:t>
       </w:r>
     </w:p>
     <w:p>
@@ -1113,304 +1051,112 @@
           <w:sz w:val="24"/>
           <w:szCs w:val="24"/>
         </w:rPr>
-        <w:t xml:space="preserve">  </w:t>
-      </w:r>
-      <w:proofErr w:type="gramStart"/>
-      <w:r>
-        <w:rPr>
-          <w:rFonts w:ascii="Times New Roman" w:hAnsi="Times New Roman" w:cs="Times New Roman"/>
-          <w:sz w:val="24"/>
-          <w:szCs w:val="24"/>
-        </w:rPr>
-        <w:t>saldo :</w:t>
-      </w:r>
-      <w:proofErr w:type="gramEnd"/>
-      <w:r>
-        <w:rPr>
-          <w:rFonts w:ascii="Times New Roman" w:hAnsi="Times New Roman" w:cs="Times New Roman"/>
-          <w:sz w:val="24"/>
-          <w:szCs w:val="24"/>
-        </w:rPr>
-        <w:t xml:space="preserve">= </w:t>
-      </w:r>
-      <w:proofErr w:type="gramStart"/>
-      <w:r>
-        <w:rPr>
-          <w:rFonts w:ascii="Times New Roman" w:hAnsi="Times New Roman" w:cs="Times New Roman"/>
-          <w:sz w:val="24"/>
-          <w:szCs w:val="24"/>
-        </w:rPr>
-        <w:t xml:space="preserve">1000000;   </w:t>
-      </w:r>
-      <w:proofErr w:type="gramEnd"/>
-      <w:r>
-        <w:rPr>
-          <w:rFonts w:ascii="Times New Roman" w:hAnsi="Times New Roman" w:cs="Times New Roman"/>
-          <w:sz w:val="24"/>
-          <w:szCs w:val="24"/>
-        </w:rPr>
-        <w:t xml:space="preserve">  </w:t>
-      </w:r>
-      <w:proofErr w:type="gramStart"/>
-      <w:r>
-        <w:rPr>
-          <w:rFonts w:ascii="Times New Roman" w:hAnsi="Times New Roman" w:cs="Times New Roman"/>
-          <w:sz w:val="24"/>
-          <w:szCs w:val="24"/>
-        </w:rPr>
-        <w:t>{ saldo</w:t>
-      </w:r>
-      <w:proofErr w:type="gramEnd"/>
-      <w:r>
-        <w:rPr>
-          <w:rFonts w:ascii="Times New Roman" w:hAnsi="Times New Roman" w:cs="Times New Roman"/>
-          <w:sz w:val="24"/>
-          <w:szCs w:val="24"/>
-        </w:rPr>
-        <w:t xml:space="preserve"> </w:t>
-      </w:r>
-      <w:proofErr w:type="gramStart"/>
-      <w:r>
-        <w:rPr>
-          <w:rFonts w:ascii="Times New Roman" w:hAnsi="Times New Roman" w:cs="Times New Roman"/>
-          <w:sz w:val="24"/>
-          <w:szCs w:val="24"/>
-        </w:rPr>
-        <w:t>awal }</w:t>
-      </w:r>
-      <w:proofErr w:type="gramEnd"/>
-    </w:p>
-    <w:p>
-      <w:pPr>
-        <w:spacing w:before="0" w:after="160"/>
-        <w:ind w:left="0"/>
-        <w:jc w:val="left"/>
-        <w:rPr>
-          <w:rFonts w:ascii="Times New Roman" w:hAnsi="Times New Roman" w:cs="Times New Roman"/>
-          <w:sz w:val="24"/>
-          <w:szCs w:val="24"/>
-        </w:rPr>
-      </w:pPr>
-      <w:r>
-        <w:rPr>
-          <w:rFonts w:ascii="Times New Roman" w:hAnsi="Times New Roman" w:cs="Times New Roman"/>
-          <w:sz w:val="24"/>
-          <w:szCs w:val="24"/>
-        </w:rPr>
-        <w:t xml:space="preserve">  </w:t>
-      </w:r>
-      <w:proofErr w:type="gramStart"/>
-      <w:r>
-        <w:rPr>
-          <w:rFonts w:ascii="Times New Roman" w:hAnsi="Times New Roman" w:cs="Times New Roman"/>
-          <w:sz w:val="24"/>
-          <w:szCs w:val="24"/>
-        </w:rPr>
-        <w:t>pin :</w:t>
-      </w:r>
-      <w:proofErr w:type="gramEnd"/>
-      <w:r>
-        <w:rPr>
-          <w:rFonts w:ascii="Times New Roman" w:hAnsi="Times New Roman" w:cs="Times New Roman"/>
-          <w:sz w:val="24"/>
-          <w:szCs w:val="24"/>
-        </w:rPr>
-        <w:t xml:space="preserve">= </w:t>
-      </w:r>
-      <w:proofErr w:type="gramStart"/>
-      <w:r>
-        <w:rPr>
-          <w:rFonts w:ascii="Times New Roman" w:hAnsi="Times New Roman" w:cs="Times New Roman"/>
-          <w:sz w:val="24"/>
-          <w:szCs w:val="24"/>
-        </w:rPr>
-        <w:t xml:space="preserve">1234;   </w:t>
-      </w:r>
-      <w:proofErr w:type="gramEnd"/>
-      <w:r>
-        <w:rPr>
-          <w:rFonts w:ascii="Times New Roman" w:hAnsi="Times New Roman" w:cs="Times New Roman"/>
-          <w:sz w:val="24"/>
-          <w:szCs w:val="24"/>
-        </w:rPr>
-        <w:t xml:space="preserve">    </w:t>
-      </w:r>
-      <w:proofErr w:type="gramStart"/>
-      <w:r>
-        <w:rPr>
-          <w:rFonts w:ascii="Times New Roman" w:hAnsi="Times New Roman" w:cs="Times New Roman"/>
-          <w:sz w:val="24"/>
-          <w:szCs w:val="24"/>
-        </w:rPr>
-        <w:t xml:space="preserve">   {</w:t>
-      </w:r>
-      <w:proofErr w:type="gramEnd"/>
-      <w:r>
-        <w:rPr>
-          <w:rFonts w:ascii="Times New Roman" w:hAnsi="Times New Roman" w:cs="Times New Roman"/>
-          <w:sz w:val="24"/>
-          <w:szCs w:val="24"/>
-        </w:rPr>
-        <w:t xml:space="preserve"> PIN </w:t>
-      </w:r>
-      <w:proofErr w:type="gramStart"/>
-      <w:r>
-        <w:rPr>
-          <w:rFonts w:ascii="Times New Roman" w:hAnsi="Times New Roman" w:cs="Times New Roman"/>
-          <w:sz w:val="24"/>
-          <w:szCs w:val="24"/>
-        </w:rPr>
-        <w:t>awal }</w:t>
-      </w:r>
-      <w:proofErr w:type="gramEnd"/>
-    </w:p>
-    <w:p>
-      <w:pPr>
-        <w:spacing w:before="0" w:after="160"/>
-        <w:ind w:left="0"/>
-        <w:jc w:val="left"/>
-        <w:rPr>
-          <w:rFonts w:ascii="Times New Roman" w:hAnsi="Times New Roman" w:cs="Times New Roman"/>
-          <w:sz w:val="24"/>
-          <w:szCs w:val="24"/>
-        </w:rPr>
-      </w:pPr>
-      <w:r>
-        <w:rPr>
-          <w:rFonts w:ascii="Times New Roman" w:hAnsi="Times New Roman" w:cs="Times New Roman"/>
-          <w:sz w:val="24"/>
-          <w:szCs w:val="24"/>
-        </w:rPr>
-        <w:t xml:space="preserve">  </w:t>
-      </w:r>
-      <w:proofErr w:type="gramStart"/>
-      <w:r>
-        <w:rPr>
-          <w:rFonts w:ascii="Times New Roman" w:hAnsi="Times New Roman" w:cs="Times New Roman"/>
-          <w:sz w:val="24"/>
-          <w:szCs w:val="24"/>
-        </w:rPr>
-        <w:t>benarPIN :</w:t>
-      </w:r>
-      <w:proofErr w:type="gramEnd"/>
-      <w:r>
-        <w:rPr>
-          <w:rFonts w:ascii="Times New Roman" w:hAnsi="Times New Roman" w:cs="Times New Roman"/>
-          <w:sz w:val="24"/>
-          <w:szCs w:val="24"/>
-        </w:rPr>
-        <w:t>= false;</w:t>
-      </w:r>
-    </w:p>
-    <w:p>
-      <w:pPr>
-        <w:spacing w:before="0" w:after="160"/>
-        <w:ind w:left="0"/>
-        <w:jc w:val="left"/>
-        <w:rPr>
-          <w:rFonts w:ascii="Times New Roman" w:hAnsi="Times New Roman" w:cs="Times New Roman"/>
-          <w:sz w:val="24"/>
-          <w:szCs w:val="24"/>
-        </w:rPr>
-      </w:pPr>
-    </w:p>
-    <w:p>
-      <w:pPr>
-        <w:spacing w:before="0" w:after="160"/>
-        <w:ind w:left="0"/>
-        <w:jc w:val="left"/>
-        <w:rPr>
-          <w:rFonts w:ascii="Times New Roman" w:hAnsi="Times New Roman" w:cs="Times New Roman"/>
-          <w:sz w:val="24"/>
-          <w:szCs w:val="24"/>
-        </w:rPr>
-      </w:pPr>
-      <w:r>
-        <w:rPr>
-          <w:rFonts w:ascii="Times New Roman" w:hAnsi="Times New Roman" w:cs="Times New Roman"/>
-          <w:sz w:val="24"/>
-          <w:szCs w:val="24"/>
-        </w:rPr>
-        <w:t xml:space="preserve">  </w:t>
-      </w:r>
-      <w:proofErr w:type="gramStart"/>
-      <w:r>
-        <w:rPr>
-          <w:rFonts w:ascii="Times New Roman" w:hAnsi="Times New Roman" w:cs="Times New Roman"/>
-          <w:sz w:val="24"/>
-          <w:szCs w:val="24"/>
-        </w:rPr>
-        <w:t>writeln(</w:t>
-      </w:r>
-      <w:proofErr w:type="gramEnd"/>
-      <w:r>
-        <w:rPr>
-          <w:rFonts w:ascii="Times New Roman" w:hAnsi="Times New Roman" w:cs="Times New Roman"/>
-          <w:sz w:val="24"/>
-          <w:szCs w:val="24"/>
-        </w:rPr>
-        <w:t>'===== SELAMAT DATANG DI ATM =====');</w:t>
-      </w:r>
-    </w:p>
-    <w:p>
-      <w:pPr>
-        <w:spacing w:before="0" w:after="160"/>
-        <w:ind w:left="0"/>
-        <w:jc w:val="left"/>
-        <w:rPr>
-          <w:rFonts w:ascii="Times New Roman" w:hAnsi="Times New Roman" w:cs="Times New Roman"/>
-          <w:sz w:val="24"/>
-          <w:szCs w:val="24"/>
-        </w:rPr>
-      </w:pPr>
-    </w:p>
-    <w:p>
-      <w:pPr>
-        <w:spacing w:before="0" w:after="160"/>
-        <w:ind w:left="0"/>
-        <w:jc w:val="left"/>
-        <w:rPr>
-          <w:rFonts w:ascii="Times New Roman" w:hAnsi="Times New Roman" w:cs="Times New Roman"/>
-          <w:sz w:val="24"/>
-          <w:szCs w:val="24"/>
-        </w:rPr>
-      </w:pPr>
-      <w:r>
-        <w:rPr>
-          <w:rFonts w:ascii="Times New Roman" w:hAnsi="Times New Roman" w:cs="Times New Roman"/>
-          <w:sz w:val="24"/>
-          <w:szCs w:val="24"/>
-        </w:rPr>
-        <w:t xml:space="preserve">  </w:t>
-      </w:r>
-      <w:proofErr w:type="gramStart"/>
-      <w:r>
-        <w:rPr>
-          <w:rFonts w:ascii="Times New Roman" w:hAnsi="Times New Roman" w:cs="Times New Roman"/>
-          <w:sz w:val="24"/>
-          <w:szCs w:val="24"/>
-        </w:rPr>
-        <w:t>{ Login</w:t>
-      </w:r>
-      <w:proofErr w:type="gramEnd"/>
-      <w:r>
-        <w:rPr>
-          <w:rFonts w:ascii="Times New Roman" w:hAnsi="Times New Roman" w:cs="Times New Roman"/>
-          <w:sz w:val="24"/>
-          <w:szCs w:val="24"/>
-        </w:rPr>
-        <w:t xml:space="preserve"> PIN maksimal 3 </w:t>
-      </w:r>
-      <w:proofErr w:type="gramStart"/>
-      <w:r>
-        <w:rPr>
-          <w:rFonts w:ascii="Times New Roman" w:hAnsi="Times New Roman" w:cs="Times New Roman"/>
-          <w:sz w:val="24"/>
-          <w:szCs w:val="24"/>
-        </w:rPr>
-        <w:t>kali }</w:t>
-      </w:r>
-      <w:proofErr w:type="gramEnd"/>
+        <w:t xml:space="preserve">  saldo := 1000000;     { saldo awal }</w:t>
+      </w:r>
+    </w:p>
+    <w:p>
+      <w:pPr>
+        <w:spacing w:before="0" w:after="160"/>
+        <w:ind w:left="0"/>
+        <w:jc w:val="left"/>
+        <w:rPr>
+          <w:rFonts w:ascii="Times New Roman" w:hAnsi="Times New Roman" w:cs="Times New Roman"/>
+          <w:sz w:val="24"/>
+          <w:szCs w:val="24"/>
+        </w:rPr>
+      </w:pPr>
+      <w:r>
+        <w:rPr>
+          <w:rFonts w:ascii="Times New Roman" w:hAnsi="Times New Roman" w:cs="Times New Roman"/>
+          <w:sz w:val="24"/>
+          <w:szCs w:val="24"/>
+        </w:rPr>
+        <w:t xml:space="preserve">  pin := 1234;          { PIN awal }</w:t>
+      </w:r>
+    </w:p>
+    <w:p>
+      <w:pPr>
+        <w:spacing w:before="0" w:after="160"/>
+        <w:ind w:left="0"/>
+        <w:jc w:val="left"/>
+        <w:rPr>
+          <w:rFonts w:ascii="Times New Roman" w:hAnsi="Times New Roman" w:cs="Times New Roman"/>
+          <w:sz w:val="24"/>
+          <w:szCs w:val="24"/>
+        </w:rPr>
+      </w:pPr>
+      <w:r>
+        <w:rPr>
+          <w:rFonts w:ascii="Times New Roman" w:hAnsi="Times New Roman" w:cs="Times New Roman"/>
+          <w:sz w:val="24"/>
+          <w:szCs w:val="24"/>
+        </w:rPr>
+        <w:t xml:space="preserve">  benarPIN := false;</w:t>
+      </w:r>
+    </w:p>
+    <w:p>
+      <w:pPr>
+        <w:spacing w:before="0" w:after="160"/>
+        <w:ind w:left="0"/>
+        <w:jc w:val="left"/>
+        <w:rPr>
+          <w:rFonts w:ascii="Times New Roman" w:hAnsi="Times New Roman" w:cs="Times New Roman"/>
+          <w:sz w:val="24"/>
+          <w:szCs w:val="24"/>
+        </w:rPr>
+      </w:pPr>
+    </w:p>
+    <w:p>
+      <w:pPr>
+        <w:spacing w:before="0" w:after="160"/>
+        <w:ind w:left="0"/>
+        <w:jc w:val="left"/>
+        <w:rPr>
+          <w:rFonts w:ascii="Times New Roman" w:hAnsi="Times New Roman" w:cs="Times New Roman"/>
+          <w:sz w:val="24"/>
+          <w:szCs w:val="24"/>
+        </w:rPr>
+      </w:pPr>
+      <w:r>
+        <w:rPr>
+          <w:rFonts w:ascii="Times New Roman" w:hAnsi="Times New Roman" w:cs="Times New Roman"/>
+          <w:sz w:val="24"/>
+          <w:szCs w:val="24"/>
+        </w:rPr>
+        <w:t xml:space="preserve">  writeln('===== SELAMAT DATANG DI ATM =====');</w:t>
+      </w:r>
+    </w:p>
+    <w:p>
+      <w:pPr>
+        <w:spacing w:before="0" w:after="160"/>
+        <w:ind w:left="0"/>
+        <w:jc w:val="left"/>
+        <w:rPr>
+          <w:rFonts w:ascii="Times New Roman" w:hAnsi="Times New Roman" w:cs="Times New Roman"/>
+          <w:sz w:val="24"/>
+          <w:szCs w:val="24"/>
+        </w:rPr>
+      </w:pPr>
+    </w:p>
+    <w:p>
+      <w:pPr>
+        <w:spacing w:before="0" w:after="160"/>
+        <w:ind w:left="0"/>
+        <w:jc w:val="left"/>
+        <w:rPr>
+          <w:rFonts w:ascii="Times New Roman" w:hAnsi="Times New Roman" w:cs="Times New Roman"/>
+          <w:sz w:val="24"/>
+          <w:szCs w:val="24"/>
+        </w:rPr>
+      </w:pPr>
+      <w:r>
+        <w:rPr>
+          <w:rFonts w:ascii="Times New Roman" w:hAnsi="Times New Roman" w:cs="Times New Roman"/>
+          <w:sz w:val="24"/>
+          <w:szCs w:val="24"/>
+        </w:rPr>
+        <w:t xml:space="preserve">  { Login PIN maksimal 3 kali }</w:t>
+      </w:r>
     </w:p>
     <w:p>
       <w:pPr>
@@ -1430,25 +1176,7 @@
           <w:szCs w:val="24"/>
         </w:rPr>
         <w:lastRenderedPageBreak/>
-        <w:t xml:space="preserve">  for </w:t>
-      </w:r>
-      <w:proofErr w:type="gramStart"/>
-      <w:r>
-        <w:rPr>
-          <w:rFonts w:ascii="Times New Roman" w:hAnsi="Times New Roman" w:cs="Times New Roman"/>
-          <w:sz w:val="24"/>
-          <w:szCs w:val="24"/>
-        </w:rPr>
-        <w:t>i :</w:t>
-      </w:r>
-      <w:proofErr w:type="gramEnd"/>
-      <w:r>
-        <w:rPr>
-          <w:rFonts w:ascii="Times New Roman" w:hAnsi="Times New Roman" w:cs="Times New Roman"/>
-          <w:sz w:val="24"/>
-          <w:szCs w:val="24"/>
-        </w:rPr>
-        <w:t>= 1 to 3 do</w:t>
+        <w:t xml:space="preserve">  for i := 1 to 3 do</w:t>
       </w:r>
     </w:p>
     <w:p>
@@ -1488,25 +1216,7 @@
           <w:sz w:val="24"/>
           <w:szCs w:val="24"/>
         </w:rPr>
-        <w:t xml:space="preserve">    </w:t>
-      </w:r>
-      <w:proofErr w:type="gramStart"/>
-      <w:r>
-        <w:rPr>
-          <w:rFonts w:ascii="Times New Roman" w:hAnsi="Times New Roman" w:cs="Times New Roman"/>
-          <w:sz w:val="24"/>
-          <w:szCs w:val="24"/>
-        </w:rPr>
-        <w:t>write(</w:t>
-      </w:r>
-      <w:proofErr w:type="gramEnd"/>
-      <w:r>
-        <w:rPr>
-          <w:rFonts w:ascii="Times New Roman" w:hAnsi="Times New Roman" w:cs="Times New Roman"/>
-          <w:sz w:val="24"/>
-          <w:szCs w:val="24"/>
-        </w:rPr>
-        <w:t>'Masukkan PIN Anda: ');</w:t>
+        <w:t xml:space="preserve">    write('Masukkan PIN Anda: ');</w:t>
       </w:r>
     </w:p>
     <w:p>
@@ -1598,25 +1308,7 @@
           <w:sz w:val="24"/>
           <w:szCs w:val="24"/>
         </w:rPr>
-        <w:t xml:space="preserve">      </w:t>
-      </w:r>
-      <w:proofErr w:type="gramStart"/>
-      <w:r>
-        <w:rPr>
-          <w:rFonts w:ascii="Times New Roman" w:hAnsi="Times New Roman" w:cs="Times New Roman"/>
-          <w:sz w:val="24"/>
-          <w:szCs w:val="24"/>
-        </w:rPr>
-        <w:t>benarPIN :</w:t>
-      </w:r>
-      <w:proofErr w:type="gramEnd"/>
-      <w:r>
-        <w:rPr>
-          <w:rFonts w:ascii="Times New Roman" w:hAnsi="Times New Roman" w:cs="Times New Roman"/>
-          <w:sz w:val="24"/>
-          <w:szCs w:val="24"/>
-        </w:rPr>
-        <w:t>= true;</w:t>
+        <w:t xml:space="preserve">      benarPIN := true;</w:t>
       </w:r>
     </w:p>
     <w:p>
@@ -1696,25 +1388,7 @@
           <w:sz w:val="24"/>
           <w:szCs w:val="24"/>
         </w:rPr>
-        <w:t xml:space="preserve">      </w:t>
-      </w:r>
-      <w:proofErr w:type="gramStart"/>
-      <w:r>
-        <w:rPr>
-          <w:rFonts w:ascii="Times New Roman" w:hAnsi="Times New Roman" w:cs="Times New Roman"/>
-          <w:sz w:val="24"/>
-          <w:szCs w:val="24"/>
-        </w:rPr>
-        <w:t>writeln(</w:t>
-      </w:r>
-      <w:proofErr w:type="gramEnd"/>
-      <w:r>
-        <w:rPr>
-          <w:rFonts w:ascii="Times New Roman" w:hAnsi="Times New Roman" w:cs="Times New Roman"/>
-          <w:sz w:val="24"/>
-          <w:szCs w:val="24"/>
-        </w:rPr>
-        <w:t>'PIN salah! Sisa percobaan: ', 3 - i);</w:t>
+        <w:t xml:space="preserve">      writeln('PIN salah! Sisa percobaan: ', 3 - i);</w:t>
       </w:r>
     </w:p>
     <w:p>
@@ -1806,25 +1480,7 @@
           <w:sz w:val="24"/>
           <w:szCs w:val="24"/>
         </w:rPr>
-        <w:t xml:space="preserve">    </w:t>
-      </w:r>
-      <w:proofErr w:type="gramStart"/>
-      <w:r>
-        <w:rPr>
-          <w:rFonts w:ascii="Times New Roman" w:hAnsi="Times New Roman" w:cs="Times New Roman"/>
-          <w:sz w:val="24"/>
-          <w:szCs w:val="24"/>
-        </w:rPr>
-        <w:t>writeln(</w:t>
-      </w:r>
-      <w:proofErr w:type="gramEnd"/>
-      <w:r>
-        <w:rPr>
-          <w:rFonts w:ascii="Times New Roman" w:hAnsi="Times New Roman" w:cs="Times New Roman"/>
-          <w:sz w:val="24"/>
-          <w:szCs w:val="24"/>
-        </w:rPr>
-        <w:t>'Kartu diblokir!');</w:t>
+        <w:t xml:space="preserve">    writeln('Kartu diblokir!');</w:t>
       </w:r>
     </w:p>
     <w:p>
@@ -1956,177 +1612,87 @@
           <w:sz w:val="24"/>
           <w:szCs w:val="24"/>
         </w:rPr>
-        <w:t xml:space="preserve">    </w:t>
-      </w:r>
-      <w:proofErr w:type="gramStart"/>
-      <w:r>
-        <w:rPr>
-          <w:rFonts w:ascii="Times New Roman" w:hAnsi="Times New Roman" w:cs="Times New Roman"/>
-          <w:sz w:val="24"/>
-          <w:szCs w:val="24"/>
-        </w:rPr>
-        <w:t>writeln(</w:t>
-      </w:r>
-      <w:proofErr w:type="gramEnd"/>
-      <w:r>
-        <w:rPr>
-          <w:rFonts w:ascii="Times New Roman" w:hAnsi="Times New Roman" w:cs="Times New Roman"/>
-          <w:sz w:val="24"/>
-          <w:szCs w:val="24"/>
-        </w:rPr>
-        <w:t>'===== MENU ATM =====');</w:t>
-      </w:r>
-    </w:p>
-    <w:p>
-      <w:pPr>
-        <w:spacing w:before="0" w:after="160"/>
-        <w:ind w:left="0"/>
-        <w:jc w:val="left"/>
-        <w:rPr>
-          <w:rFonts w:ascii="Times New Roman" w:hAnsi="Times New Roman" w:cs="Times New Roman"/>
-          <w:sz w:val="24"/>
-          <w:szCs w:val="24"/>
-        </w:rPr>
-      </w:pPr>
-      <w:r>
-        <w:rPr>
-          <w:rFonts w:ascii="Times New Roman" w:hAnsi="Times New Roman" w:cs="Times New Roman"/>
-          <w:sz w:val="24"/>
-          <w:szCs w:val="24"/>
-        </w:rPr>
-        <w:t xml:space="preserve">    </w:t>
-      </w:r>
-      <w:proofErr w:type="gramStart"/>
-      <w:r>
-        <w:rPr>
-          <w:rFonts w:ascii="Times New Roman" w:hAnsi="Times New Roman" w:cs="Times New Roman"/>
-          <w:sz w:val="24"/>
-          <w:szCs w:val="24"/>
-        </w:rPr>
-        <w:t>writeln(</w:t>
-      </w:r>
-      <w:proofErr w:type="gramEnd"/>
-      <w:r>
-        <w:rPr>
-          <w:rFonts w:ascii="Times New Roman" w:hAnsi="Times New Roman" w:cs="Times New Roman"/>
-          <w:sz w:val="24"/>
-          <w:szCs w:val="24"/>
-        </w:rPr>
-        <w:t>'1. Cek Saldo');</w:t>
-      </w:r>
-    </w:p>
-    <w:p>
-      <w:pPr>
-        <w:spacing w:before="0" w:after="160"/>
-        <w:ind w:left="0"/>
-        <w:jc w:val="left"/>
-        <w:rPr>
-          <w:rFonts w:ascii="Times New Roman" w:hAnsi="Times New Roman" w:cs="Times New Roman"/>
-          <w:sz w:val="24"/>
-          <w:szCs w:val="24"/>
-        </w:rPr>
-      </w:pPr>
-      <w:r>
-        <w:rPr>
-          <w:rFonts w:ascii="Times New Roman" w:hAnsi="Times New Roman" w:cs="Times New Roman"/>
-          <w:sz w:val="24"/>
-          <w:szCs w:val="24"/>
-        </w:rPr>
-        <w:t xml:space="preserve">    </w:t>
-      </w:r>
-      <w:proofErr w:type="gramStart"/>
-      <w:r>
-        <w:rPr>
-          <w:rFonts w:ascii="Times New Roman" w:hAnsi="Times New Roman" w:cs="Times New Roman"/>
-          <w:sz w:val="24"/>
-          <w:szCs w:val="24"/>
-        </w:rPr>
-        <w:t>writeln(</w:t>
-      </w:r>
-      <w:proofErr w:type="gramEnd"/>
-      <w:r>
-        <w:rPr>
-          <w:rFonts w:ascii="Times New Roman" w:hAnsi="Times New Roman" w:cs="Times New Roman"/>
-          <w:sz w:val="24"/>
-          <w:szCs w:val="24"/>
-        </w:rPr>
-        <w:t>'2. Tarik Tunai');</w:t>
-      </w:r>
-    </w:p>
-    <w:p>
-      <w:pPr>
-        <w:spacing w:before="0" w:after="160"/>
-        <w:ind w:left="0"/>
-        <w:jc w:val="left"/>
-        <w:rPr>
-          <w:rFonts w:ascii="Times New Roman" w:hAnsi="Times New Roman" w:cs="Times New Roman"/>
-          <w:sz w:val="24"/>
-          <w:szCs w:val="24"/>
-        </w:rPr>
-      </w:pPr>
-      <w:r>
-        <w:rPr>
-          <w:rFonts w:ascii="Times New Roman" w:hAnsi="Times New Roman" w:cs="Times New Roman"/>
-          <w:sz w:val="24"/>
-          <w:szCs w:val="24"/>
-        </w:rPr>
-        <w:t xml:space="preserve">    </w:t>
-      </w:r>
-      <w:proofErr w:type="gramStart"/>
-      <w:r>
-        <w:rPr>
-          <w:rFonts w:ascii="Times New Roman" w:hAnsi="Times New Roman" w:cs="Times New Roman"/>
-          <w:sz w:val="24"/>
-          <w:szCs w:val="24"/>
-        </w:rPr>
-        <w:t>writeln(</w:t>
-      </w:r>
-      <w:proofErr w:type="gramEnd"/>
-      <w:r>
-        <w:rPr>
-          <w:rFonts w:ascii="Times New Roman" w:hAnsi="Times New Roman" w:cs="Times New Roman"/>
-          <w:sz w:val="24"/>
-          <w:szCs w:val="24"/>
-        </w:rPr>
-        <w:t>'3. Setor Tunai');</w:t>
-      </w:r>
-    </w:p>
-    <w:p>
-      <w:pPr>
-        <w:spacing w:before="0" w:after="160"/>
-        <w:ind w:left="0"/>
-        <w:jc w:val="left"/>
-        <w:rPr>
-          <w:rFonts w:ascii="Times New Roman" w:hAnsi="Times New Roman" w:cs="Times New Roman"/>
-          <w:sz w:val="24"/>
-          <w:szCs w:val="24"/>
-        </w:rPr>
-      </w:pPr>
-      <w:r>
-        <w:rPr>
-          <w:rFonts w:ascii="Times New Roman" w:hAnsi="Times New Roman" w:cs="Times New Roman"/>
-          <w:sz w:val="24"/>
-          <w:szCs w:val="24"/>
-        </w:rPr>
-        <w:t xml:space="preserve">    </w:t>
-      </w:r>
-      <w:proofErr w:type="gramStart"/>
-      <w:r>
-        <w:rPr>
-          <w:rFonts w:ascii="Times New Roman" w:hAnsi="Times New Roman" w:cs="Times New Roman"/>
-          <w:sz w:val="24"/>
-          <w:szCs w:val="24"/>
-        </w:rPr>
-        <w:t>writeln(</w:t>
-      </w:r>
-      <w:proofErr w:type="gramEnd"/>
-      <w:r>
-        <w:rPr>
-          <w:rFonts w:ascii="Times New Roman" w:hAnsi="Times New Roman" w:cs="Times New Roman"/>
-          <w:sz w:val="24"/>
-          <w:szCs w:val="24"/>
-        </w:rPr>
-        <w:t>'4. Transfer');</w:t>
+        <w:t xml:space="preserve">    writeln('===== MENU ATM =====');</w:t>
+      </w:r>
+    </w:p>
+    <w:p>
+      <w:pPr>
+        <w:spacing w:before="0" w:after="160"/>
+        <w:ind w:left="0"/>
+        <w:jc w:val="left"/>
+        <w:rPr>
+          <w:rFonts w:ascii="Times New Roman" w:hAnsi="Times New Roman" w:cs="Times New Roman"/>
+          <w:sz w:val="24"/>
+          <w:szCs w:val="24"/>
+        </w:rPr>
+      </w:pPr>
+      <w:r>
+        <w:rPr>
+          <w:rFonts w:ascii="Times New Roman" w:hAnsi="Times New Roman" w:cs="Times New Roman"/>
+          <w:sz w:val="24"/>
+          <w:szCs w:val="24"/>
+        </w:rPr>
+        <w:t xml:space="preserve">    writeln('1. Cek Saldo');</w:t>
+      </w:r>
+    </w:p>
+    <w:p>
+      <w:pPr>
+        <w:spacing w:before="0" w:after="160"/>
+        <w:ind w:left="0"/>
+        <w:jc w:val="left"/>
+        <w:rPr>
+          <w:rFonts w:ascii="Times New Roman" w:hAnsi="Times New Roman" w:cs="Times New Roman"/>
+          <w:sz w:val="24"/>
+          <w:szCs w:val="24"/>
+        </w:rPr>
+      </w:pPr>
+      <w:r>
+        <w:rPr>
+          <w:rFonts w:ascii="Times New Roman" w:hAnsi="Times New Roman" w:cs="Times New Roman"/>
+          <w:sz w:val="24"/>
+          <w:szCs w:val="24"/>
+        </w:rPr>
+        <w:t xml:space="preserve">    writeln('2. Tarik Tunai');</w:t>
+      </w:r>
+    </w:p>
+    <w:p>
+      <w:pPr>
+        <w:spacing w:before="0" w:after="160"/>
+        <w:ind w:left="0"/>
+        <w:jc w:val="left"/>
+        <w:rPr>
+          <w:rFonts w:ascii="Times New Roman" w:hAnsi="Times New Roman" w:cs="Times New Roman"/>
+          <w:sz w:val="24"/>
+          <w:szCs w:val="24"/>
+        </w:rPr>
+      </w:pPr>
+      <w:r>
+        <w:rPr>
+          <w:rFonts w:ascii="Times New Roman" w:hAnsi="Times New Roman" w:cs="Times New Roman"/>
+          <w:sz w:val="24"/>
+          <w:szCs w:val="24"/>
+        </w:rPr>
+        <w:t xml:space="preserve">    writeln('3. Setor Tunai');</w:t>
+      </w:r>
+    </w:p>
+    <w:p>
+      <w:pPr>
+        <w:spacing w:before="0" w:after="160"/>
+        <w:ind w:left="0"/>
+        <w:jc w:val="left"/>
+        <w:rPr>
+          <w:rFonts w:ascii="Times New Roman" w:hAnsi="Times New Roman" w:cs="Times New Roman"/>
+          <w:sz w:val="24"/>
+          <w:szCs w:val="24"/>
+        </w:rPr>
+      </w:pPr>
+      <w:r>
+        <w:rPr>
+          <w:rFonts w:ascii="Times New Roman" w:hAnsi="Times New Roman" w:cs="Times New Roman"/>
+          <w:sz w:val="24"/>
+          <w:szCs w:val="24"/>
+        </w:rPr>
+        <w:t xml:space="preserve">    writeln('4. Transfer');</w:t>
       </w:r>
     </w:p>
     <w:p>
@@ -2147,101 +1713,47 @@
           <w:szCs w:val="24"/>
         </w:rPr>
         <w:lastRenderedPageBreak/>
-        <w:t xml:space="preserve">    </w:t>
-      </w:r>
-      <w:proofErr w:type="gramStart"/>
-      <w:r>
-        <w:rPr>
-          <w:rFonts w:ascii="Times New Roman" w:hAnsi="Times New Roman" w:cs="Times New Roman"/>
-          <w:sz w:val="24"/>
-          <w:szCs w:val="24"/>
-        </w:rPr>
-        <w:t>writeln(</w:t>
-      </w:r>
-      <w:proofErr w:type="gramEnd"/>
-      <w:r>
-        <w:rPr>
-          <w:rFonts w:ascii="Times New Roman" w:hAnsi="Times New Roman" w:cs="Times New Roman"/>
-          <w:sz w:val="24"/>
-          <w:szCs w:val="24"/>
-        </w:rPr>
-        <w:t>'5. Ganti PIN');</w:t>
-      </w:r>
-    </w:p>
-    <w:p>
-      <w:pPr>
-        <w:spacing w:before="0" w:after="160"/>
-        <w:ind w:left="0"/>
-        <w:jc w:val="left"/>
-        <w:rPr>
-          <w:rFonts w:ascii="Times New Roman" w:hAnsi="Times New Roman" w:cs="Times New Roman"/>
-          <w:sz w:val="24"/>
-          <w:szCs w:val="24"/>
-        </w:rPr>
-      </w:pPr>
-      <w:r>
-        <w:rPr>
-          <w:rFonts w:ascii="Times New Roman" w:hAnsi="Times New Roman" w:cs="Times New Roman"/>
-          <w:sz w:val="24"/>
-          <w:szCs w:val="24"/>
-        </w:rPr>
-        <w:t xml:space="preserve">    </w:t>
-      </w:r>
-      <w:proofErr w:type="gramStart"/>
-      <w:r>
-        <w:rPr>
-          <w:rFonts w:ascii="Times New Roman" w:hAnsi="Times New Roman" w:cs="Times New Roman"/>
-          <w:sz w:val="24"/>
-          <w:szCs w:val="24"/>
-        </w:rPr>
-        <w:t>writeln(</w:t>
-      </w:r>
-      <w:proofErr w:type="gramEnd"/>
-      <w:r>
-        <w:rPr>
-          <w:rFonts w:ascii="Times New Roman" w:hAnsi="Times New Roman" w:cs="Times New Roman"/>
-          <w:sz w:val="24"/>
-          <w:szCs w:val="24"/>
-        </w:rPr>
-        <w:t>'6. Keluar');</w:t>
-      </w:r>
-    </w:p>
-    <w:p>
-      <w:pPr>
-        <w:spacing w:before="0" w:after="160"/>
-        <w:ind w:left="0"/>
-        <w:jc w:val="left"/>
-        <w:rPr>
-          <w:rFonts w:ascii="Times New Roman" w:hAnsi="Times New Roman" w:cs="Times New Roman"/>
-          <w:sz w:val="24"/>
-          <w:szCs w:val="24"/>
-        </w:rPr>
-      </w:pPr>
-      <w:r>
-        <w:rPr>
-          <w:rFonts w:ascii="Times New Roman" w:hAnsi="Times New Roman" w:cs="Times New Roman"/>
-          <w:sz w:val="24"/>
-          <w:szCs w:val="24"/>
-        </w:rPr>
-        <w:t xml:space="preserve">    </w:t>
-      </w:r>
-      <w:proofErr w:type="gramStart"/>
-      <w:r>
-        <w:rPr>
-          <w:rFonts w:ascii="Times New Roman" w:hAnsi="Times New Roman" w:cs="Times New Roman"/>
-          <w:sz w:val="24"/>
-          <w:szCs w:val="24"/>
-        </w:rPr>
-        <w:t>write(</w:t>
-      </w:r>
-      <w:proofErr w:type="gramEnd"/>
-      <w:r>
-        <w:rPr>
-          <w:rFonts w:ascii="Times New Roman" w:hAnsi="Times New Roman" w:cs="Times New Roman"/>
-          <w:sz w:val="24"/>
-          <w:szCs w:val="24"/>
-        </w:rPr>
-        <w:t>'Pilih menu (1-6): ');</w:t>
+        <w:t xml:space="preserve">    writeln('5. Ganti PIN');</w:t>
+      </w:r>
+    </w:p>
+    <w:p>
+      <w:pPr>
+        <w:spacing w:before="0" w:after="160"/>
+        <w:ind w:left="0"/>
+        <w:jc w:val="left"/>
+        <w:rPr>
+          <w:rFonts w:ascii="Times New Roman" w:hAnsi="Times New Roman" w:cs="Times New Roman"/>
+          <w:sz w:val="24"/>
+          <w:szCs w:val="24"/>
+        </w:rPr>
+      </w:pPr>
+      <w:r>
+        <w:rPr>
+          <w:rFonts w:ascii="Times New Roman" w:hAnsi="Times New Roman" w:cs="Times New Roman"/>
+          <w:sz w:val="24"/>
+          <w:szCs w:val="24"/>
+        </w:rPr>
+        <w:t xml:space="preserve">    writeln('6. Keluar');</w:t>
+      </w:r>
+    </w:p>
+    <w:p>
+      <w:pPr>
+        <w:spacing w:before="0" w:after="160"/>
+        <w:ind w:left="0"/>
+        <w:jc w:val="left"/>
+        <w:rPr>
+          <w:rFonts w:ascii="Times New Roman" w:hAnsi="Times New Roman" w:cs="Times New Roman"/>
+          <w:sz w:val="24"/>
+          <w:szCs w:val="24"/>
+        </w:rPr>
+      </w:pPr>
+      <w:r>
+        <w:rPr>
+          <w:rFonts w:ascii="Times New Roman" w:hAnsi="Times New Roman" w:cs="Times New Roman"/>
+          <w:sz w:val="24"/>
+          <w:szCs w:val="24"/>
+        </w:rPr>
+        <w:t xml:space="preserve">    write('Pilih menu (1-6): ');</w:t>
       </w:r>
     </w:p>
     <w:p>
@@ -2333,63 +1845,27 @@
           <w:sz w:val="24"/>
           <w:szCs w:val="24"/>
         </w:rPr>
-        <w:t xml:space="preserve">      </w:t>
-      </w:r>
-      <w:proofErr w:type="gramStart"/>
-      <w:r>
-        <w:rPr>
-          <w:rFonts w:ascii="Times New Roman" w:hAnsi="Times New Roman" w:cs="Times New Roman"/>
-          <w:sz w:val="24"/>
-          <w:szCs w:val="24"/>
-        </w:rPr>
-        <w:t>writeln(</w:t>
-      </w:r>
-      <w:proofErr w:type="gramEnd"/>
-      <w:r>
-        <w:rPr>
-          <w:rFonts w:ascii="Times New Roman" w:hAnsi="Times New Roman" w:cs="Times New Roman"/>
-          <w:sz w:val="24"/>
-          <w:szCs w:val="24"/>
-        </w:rPr>
-        <w:t>'Menu tidak valid!');</w:t>
-      </w:r>
-    </w:p>
-    <w:p>
-      <w:pPr>
-        <w:spacing w:before="0" w:after="160"/>
-        <w:ind w:left="0"/>
-        <w:jc w:val="left"/>
-        <w:rPr>
-          <w:rFonts w:ascii="Times New Roman" w:hAnsi="Times New Roman" w:cs="Times New Roman"/>
-          <w:sz w:val="24"/>
-          <w:szCs w:val="24"/>
-        </w:rPr>
-      </w:pPr>
-      <w:r>
-        <w:rPr>
-          <w:rFonts w:ascii="Times New Roman" w:hAnsi="Times New Roman" w:cs="Times New Roman"/>
-          <w:sz w:val="24"/>
-          <w:szCs w:val="24"/>
-        </w:rPr>
-        <w:t xml:space="preserve">      </w:t>
-      </w:r>
-      <w:proofErr w:type="gramStart"/>
-      <w:r>
-        <w:rPr>
-          <w:rFonts w:ascii="Times New Roman" w:hAnsi="Times New Roman" w:cs="Times New Roman"/>
-          <w:sz w:val="24"/>
-          <w:szCs w:val="24"/>
-        </w:rPr>
-        <w:t>write(</w:t>
-      </w:r>
-      <w:proofErr w:type="gramEnd"/>
-      <w:r>
-        <w:rPr>
-          <w:rFonts w:ascii="Times New Roman" w:hAnsi="Times New Roman" w:cs="Times New Roman"/>
-          <w:sz w:val="24"/>
-          <w:szCs w:val="24"/>
-        </w:rPr>
-        <w:t>'Pilih menu (1-6): ');</w:t>
+        <w:t xml:space="preserve">      writeln('Menu tidak valid!');</w:t>
+      </w:r>
+    </w:p>
+    <w:p>
+      <w:pPr>
+        <w:spacing w:before="0" w:after="160"/>
+        <w:ind w:left="0"/>
+        <w:jc w:val="left"/>
+        <w:rPr>
+          <w:rFonts w:ascii="Times New Roman" w:hAnsi="Times New Roman" w:cs="Times New Roman"/>
+          <w:sz w:val="24"/>
+          <w:szCs w:val="24"/>
+        </w:rPr>
+      </w:pPr>
+      <w:r>
+        <w:rPr>
+          <w:rFonts w:ascii="Times New Roman" w:hAnsi="Times New Roman" w:cs="Times New Roman"/>
+          <w:sz w:val="24"/>
+          <w:szCs w:val="24"/>
+        </w:rPr>
+        <w:t xml:space="preserve">      write('Pilih menu (1-6): ');</w:t>
       </w:r>
     </w:p>
     <w:p>
@@ -2513,25 +1989,7 @@
           <w:sz w:val="24"/>
           <w:szCs w:val="24"/>
         </w:rPr>
-        <w:t xml:space="preserve">           </w:t>
-      </w:r>
-      <w:proofErr w:type="gramStart"/>
-      <w:r>
-        <w:rPr>
-          <w:rFonts w:ascii="Times New Roman" w:hAnsi="Times New Roman" w:cs="Times New Roman"/>
-          <w:sz w:val="24"/>
-          <w:szCs w:val="24"/>
-        </w:rPr>
-        <w:t>writeln(</w:t>
-      </w:r>
-      <w:proofErr w:type="gramEnd"/>
-      <w:r>
-        <w:rPr>
-          <w:rFonts w:ascii="Times New Roman" w:hAnsi="Times New Roman" w:cs="Times New Roman"/>
-          <w:sz w:val="24"/>
-          <w:szCs w:val="24"/>
-        </w:rPr>
-        <w:t>'Saldo Anda: Rp ', saldo);</w:t>
+        <w:t xml:space="preserve">           writeln('Saldo Anda: Rp ', saldo);</w:t>
       </w:r>
     </w:p>
     <w:p>
@@ -2603,25 +2061,7 @@
           <w:sz w:val="24"/>
           <w:szCs w:val="24"/>
         </w:rPr>
-        <w:t xml:space="preserve">           </w:t>
-      </w:r>
-      <w:proofErr w:type="gramStart"/>
-      <w:r>
-        <w:rPr>
-          <w:rFonts w:ascii="Times New Roman" w:hAnsi="Times New Roman" w:cs="Times New Roman"/>
-          <w:sz w:val="24"/>
-          <w:szCs w:val="24"/>
-        </w:rPr>
-        <w:t>write(</w:t>
-      </w:r>
-      <w:proofErr w:type="gramEnd"/>
-      <w:r>
-        <w:rPr>
-          <w:rFonts w:ascii="Times New Roman" w:hAnsi="Times New Roman" w:cs="Times New Roman"/>
-          <w:sz w:val="24"/>
-          <w:szCs w:val="24"/>
-        </w:rPr>
-        <w:t>'Masukkan jumlah tarik: ');</w:t>
+        <w:t xml:space="preserve">           write('Masukkan jumlah tarik: ');</w:t>
       </w:r>
     </w:p>
     <w:p>
@@ -2693,25 +2133,7 @@
           <w:sz w:val="24"/>
           <w:szCs w:val="24"/>
         </w:rPr>
-        <w:t xml:space="preserve">             </w:t>
-      </w:r>
-      <w:proofErr w:type="gramStart"/>
-      <w:r>
-        <w:rPr>
-          <w:rFonts w:ascii="Times New Roman" w:hAnsi="Times New Roman" w:cs="Times New Roman"/>
-          <w:sz w:val="24"/>
-          <w:szCs w:val="24"/>
-        </w:rPr>
-        <w:t>writeln(</w:t>
-      </w:r>
-      <w:proofErr w:type="gramEnd"/>
-      <w:r>
-        <w:rPr>
-          <w:rFonts w:ascii="Times New Roman" w:hAnsi="Times New Roman" w:cs="Times New Roman"/>
-          <w:sz w:val="24"/>
-          <w:szCs w:val="24"/>
-        </w:rPr>
-        <w:t>'Jumlah tidak valid!')</w:t>
+        <w:t xml:space="preserve">             writeln('Jumlah tidak valid!')</w:t>
       </w:r>
     </w:p>
     <w:p>
@@ -2751,25 +2173,7 @@
           <w:sz w:val="24"/>
           <w:szCs w:val="24"/>
         </w:rPr>
-        <w:t xml:space="preserve">             </w:t>
-      </w:r>
-      <w:proofErr w:type="gramStart"/>
-      <w:r>
-        <w:rPr>
-          <w:rFonts w:ascii="Times New Roman" w:hAnsi="Times New Roman" w:cs="Times New Roman"/>
-          <w:sz w:val="24"/>
-          <w:szCs w:val="24"/>
-        </w:rPr>
-        <w:t>writeln(</w:t>
-      </w:r>
-      <w:proofErr w:type="gramEnd"/>
-      <w:r>
-        <w:rPr>
-          <w:rFonts w:ascii="Times New Roman" w:hAnsi="Times New Roman" w:cs="Times New Roman"/>
-          <w:sz w:val="24"/>
-          <w:szCs w:val="24"/>
-        </w:rPr>
-        <w:t>'Saldo tidak cukup!')</w:t>
+        <w:t xml:space="preserve">             writeln('Saldo tidak cukup!')</w:t>
       </w:r>
     </w:p>
     <w:p>
@@ -2830,101 +2234,47 @@
           <w:szCs w:val="24"/>
         </w:rPr>
         <w:lastRenderedPageBreak/>
-        <w:t xml:space="preserve">             </w:t>
-      </w:r>
-      <w:proofErr w:type="gramStart"/>
-      <w:r>
-        <w:rPr>
-          <w:rFonts w:ascii="Times New Roman" w:hAnsi="Times New Roman" w:cs="Times New Roman"/>
-          <w:sz w:val="24"/>
-          <w:szCs w:val="24"/>
-        </w:rPr>
-        <w:t>saldo :</w:t>
-      </w:r>
-      <w:proofErr w:type="gramEnd"/>
-      <w:r>
-        <w:rPr>
-          <w:rFonts w:ascii="Times New Roman" w:hAnsi="Times New Roman" w:cs="Times New Roman"/>
-          <w:sz w:val="24"/>
-          <w:szCs w:val="24"/>
-        </w:rPr>
-        <w:t>= saldo - tarik;</w:t>
-      </w:r>
-    </w:p>
-    <w:p>
-      <w:pPr>
-        <w:spacing w:before="0" w:after="160"/>
-        <w:ind w:left="0"/>
-        <w:jc w:val="left"/>
-        <w:rPr>
-          <w:rFonts w:ascii="Times New Roman" w:hAnsi="Times New Roman" w:cs="Times New Roman"/>
-          <w:sz w:val="24"/>
-          <w:szCs w:val="24"/>
-        </w:rPr>
-      </w:pPr>
-      <w:r>
-        <w:rPr>
-          <w:rFonts w:ascii="Times New Roman" w:hAnsi="Times New Roman" w:cs="Times New Roman"/>
-          <w:sz w:val="24"/>
-          <w:szCs w:val="24"/>
-        </w:rPr>
-        <w:t xml:space="preserve">             </w:t>
-      </w:r>
-      <w:proofErr w:type="gramStart"/>
-      <w:r>
-        <w:rPr>
-          <w:rFonts w:ascii="Times New Roman" w:hAnsi="Times New Roman" w:cs="Times New Roman"/>
-          <w:sz w:val="24"/>
-          <w:szCs w:val="24"/>
-        </w:rPr>
-        <w:t>writeln(</w:t>
-      </w:r>
-      <w:proofErr w:type="gramEnd"/>
-      <w:r>
-        <w:rPr>
-          <w:rFonts w:ascii="Times New Roman" w:hAnsi="Times New Roman" w:cs="Times New Roman"/>
-          <w:sz w:val="24"/>
-          <w:szCs w:val="24"/>
-        </w:rPr>
-        <w:t>'Tarik tunai berhasil!');</w:t>
-      </w:r>
-    </w:p>
-    <w:p>
-      <w:pPr>
-        <w:spacing w:before="0" w:after="160"/>
-        <w:ind w:left="0"/>
-        <w:jc w:val="left"/>
-        <w:rPr>
-          <w:rFonts w:ascii="Times New Roman" w:hAnsi="Times New Roman" w:cs="Times New Roman"/>
-          <w:sz w:val="24"/>
-          <w:szCs w:val="24"/>
-        </w:rPr>
-      </w:pPr>
-      <w:r>
-        <w:rPr>
-          <w:rFonts w:ascii="Times New Roman" w:hAnsi="Times New Roman" w:cs="Times New Roman"/>
-          <w:sz w:val="24"/>
-          <w:szCs w:val="24"/>
-        </w:rPr>
-        <w:t xml:space="preserve">             </w:t>
-      </w:r>
-      <w:proofErr w:type="gramStart"/>
-      <w:r>
-        <w:rPr>
-          <w:rFonts w:ascii="Times New Roman" w:hAnsi="Times New Roman" w:cs="Times New Roman"/>
-          <w:sz w:val="24"/>
-          <w:szCs w:val="24"/>
-        </w:rPr>
-        <w:t>StrukTransaksi(</w:t>
-      </w:r>
-      <w:proofErr w:type="gramEnd"/>
-      <w:r>
-        <w:rPr>
-          <w:rFonts w:ascii="Times New Roman" w:hAnsi="Times New Roman" w:cs="Times New Roman"/>
-          <w:sz w:val="24"/>
-          <w:szCs w:val="24"/>
-        </w:rPr>
-        <w:t>'Tarik Tunai', tarik);</w:t>
+        <w:t xml:space="preserve">             saldo := saldo - tarik;</w:t>
+      </w:r>
+    </w:p>
+    <w:p>
+      <w:pPr>
+        <w:spacing w:before="0" w:after="160"/>
+        <w:ind w:left="0"/>
+        <w:jc w:val="left"/>
+        <w:rPr>
+          <w:rFonts w:ascii="Times New Roman" w:hAnsi="Times New Roman" w:cs="Times New Roman"/>
+          <w:sz w:val="24"/>
+          <w:szCs w:val="24"/>
+        </w:rPr>
+      </w:pPr>
+      <w:r>
+        <w:rPr>
+          <w:rFonts w:ascii="Times New Roman" w:hAnsi="Times New Roman" w:cs="Times New Roman"/>
+          <w:sz w:val="24"/>
+          <w:szCs w:val="24"/>
+        </w:rPr>
+        <w:t xml:space="preserve">             writeln('Tarik tunai berhasil!');</w:t>
+      </w:r>
+    </w:p>
+    <w:p>
+      <w:pPr>
+        <w:spacing w:before="0" w:after="160"/>
+        <w:ind w:left="0"/>
+        <w:jc w:val="left"/>
+        <w:rPr>
+          <w:rFonts w:ascii="Times New Roman" w:hAnsi="Times New Roman" w:cs="Times New Roman"/>
+          <w:sz w:val="24"/>
+          <w:szCs w:val="24"/>
+        </w:rPr>
+      </w:pPr>
+      <w:r>
+        <w:rPr>
+          <w:rFonts w:ascii="Times New Roman" w:hAnsi="Times New Roman" w:cs="Times New Roman"/>
+          <w:sz w:val="24"/>
+          <w:szCs w:val="24"/>
+        </w:rPr>
+        <w:t xml:space="preserve">             StrukTransaksi('Tarik Tunai', tarik);</w:t>
       </w:r>
     </w:p>
     <w:p>
@@ -3016,25 +2366,7 @@
           <w:sz w:val="24"/>
           <w:szCs w:val="24"/>
         </w:rPr>
-        <w:t xml:space="preserve">           </w:t>
-      </w:r>
-      <w:proofErr w:type="gramStart"/>
-      <w:r>
-        <w:rPr>
-          <w:rFonts w:ascii="Times New Roman" w:hAnsi="Times New Roman" w:cs="Times New Roman"/>
-          <w:sz w:val="24"/>
-          <w:szCs w:val="24"/>
-        </w:rPr>
-        <w:t>write(</w:t>
-      </w:r>
-      <w:proofErr w:type="gramEnd"/>
-      <w:r>
-        <w:rPr>
-          <w:rFonts w:ascii="Times New Roman" w:hAnsi="Times New Roman" w:cs="Times New Roman"/>
-          <w:sz w:val="24"/>
-          <w:szCs w:val="24"/>
-        </w:rPr>
-        <w:t>'Masukkan jumlah setor: ');</w:t>
+        <w:t xml:space="preserve">           write('Masukkan jumlah setor: ');</w:t>
       </w:r>
     </w:p>
     <w:p>
@@ -3106,25 +2438,7 @@
           <w:sz w:val="24"/>
           <w:szCs w:val="24"/>
         </w:rPr>
-        <w:t xml:space="preserve">             </w:t>
-      </w:r>
-      <w:proofErr w:type="gramStart"/>
-      <w:r>
-        <w:rPr>
-          <w:rFonts w:ascii="Times New Roman" w:hAnsi="Times New Roman" w:cs="Times New Roman"/>
-          <w:sz w:val="24"/>
-          <w:szCs w:val="24"/>
-        </w:rPr>
-        <w:t>writeln(</w:t>
-      </w:r>
-      <w:proofErr w:type="gramEnd"/>
-      <w:r>
-        <w:rPr>
-          <w:rFonts w:ascii="Times New Roman" w:hAnsi="Times New Roman" w:cs="Times New Roman"/>
-          <w:sz w:val="24"/>
-          <w:szCs w:val="24"/>
-        </w:rPr>
-        <w:t>'Jumlah tidak valid!')</w:t>
+        <w:t xml:space="preserve">             writeln('Jumlah tidak valid!')</w:t>
       </w:r>
     </w:p>
     <w:p>
@@ -3184,101 +2498,47 @@
           <w:sz w:val="24"/>
           <w:szCs w:val="24"/>
         </w:rPr>
-        <w:t xml:space="preserve">             </w:t>
-      </w:r>
-      <w:proofErr w:type="gramStart"/>
-      <w:r>
-        <w:rPr>
-          <w:rFonts w:ascii="Times New Roman" w:hAnsi="Times New Roman" w:cs="Times New Roman"/>
-          <w:sz w:val="24"/>
-          <w:szCs w:val="24"/>
-        </w:rPr>
-        <w:t>saldo :</w:t>
-      </w:r>
-      <w:proofErr w:type="gramEnd"/>
-      <w:r>
-        <w:rPr>
-          <w:rFonts w:ascii="Times New Roman" w:hAnsi="Times New Roman" w:cs="Times New Roman"/>
-          <w:sz w:val="24"/>
-          <w:szCs w:val="24"/>
-        </w:rPr>
-        <w:t>= saldo + setor;</w:t>
-      </w:r>
-    </w:p>
-    <w:p>
-      <w:pPr>
-        <w:spacing w:before="0" w:after="160"/>
-        <w:ind w:left="0"/>
-        <w:jc w:val="left"/>
-        <w:rPr>
-          <w:rFonts w:ascii="Times New Roman" w:hAnsi="Times New Roman" w:cs="Times New Roman"/>
-          <w:sz w:val="24"/>
-          <w:szCs w:val="24"/>
-        </w:rPr>
-      </w:pPr>
-      <w:r>
-        <w:rPr>
-          <w:rFonts w:ascii="Times New Roman" w:hAnsi="Times New Roman" w:cs="Times New Roman"/>
-          <w:sz w:val="24"/>
-          <w:szCs w:val="24"/>
-        </w:rPr>
-        <w:t xml:space="preserve">             </w:t>
-      </w:r>
-      <w:proofErr w:type="gramStart"/>
-      <w:r>
-        <w:rPr>
-          <w:rFonts w:ascii="Times New Roman" w:hAnsi="Times New Roman" w:cs="Times New Roman"/>
-          <w:sz w:val="24"/>
-          <w:szCs w:val="24"/>
-        </w:rPr>
-        <w:t>writeln(</w:t>
-      </w:r>
-      <w:proofErr w:type="gramEnd"/>
-      <w:r>
-        <w:rPr>
-          <w:rFonts w:ascii="Times New Roman" w:hAnsi="Times New Roman" w:cs="Times New Roman"/>
-          <w:sz w:val="24"/>
-          <w:szCs w:val="24"/>
-        </w:rPr>
-        <w:t>'Setor tunai berhasil!');</w:t>
-      </w:r>
-    </w:p>
-    <w:p>
-      <w:pPr>
-        <w:spacing w:before="0" w:after="160"/>
-        <w:ind w:left="0"/>
-        <w:jc w:val="left"/>
-        <w:rPr>
-          <w:rFonts w:ascii="Times New Roman" w:hAnsi="Times New Roman" w:cs="Times New Roman"/>
-          <w:sz w:val="24"/>
-          <w:szCs w:val="24"/>
-        </w:rPr>
-      </w:pPr>
-      <w:r>
-        <w:rPr>
-          <w:rFonts w:ascii="Times New Roman" w:hAnsi="Times New Roman" w:cs="Times New Roman"/>
-          <w:sz w:val="24"/>
-          <w:szCs w:val="24"/>
-        </w:rPr>
-        <w:t xml:space="preserve">             </w:t>
-      </w:r>
-      <w:proofErr w:type="gramStart"/>
-      <w:r>
-        <w:rPr>
-          <w:rFonts w:ascii="Times New Roman" w:hAnsi="Times New Roman" w:cs="Times New Roman"/>
-          <w:sz w:val="24"/>
-          <w:szCs w:val="24"/>
-        </w:rPr>
-        <w:t>StrukTransaksi(</w:t>
-      </w:r>
-      <w:proofErr w:type="gramEnd"/>
-      <w:r>
-        <w:rPr>
-          <w:rFonts w:ascii="Times New Roman" w:hAnsi="Times New Roman" w:cs="Times New Roman"/>
-          <w:sz w:val="24"/>
-          <w:szCs w:val="24"/>
-        </w:rPr>
-        <w:t>'Setor Tunai', setor);</w:t>
+        <w:t xml:space="preserve">             saldo := saldo + setor;</w:t>
+      </w:r>
+    </w:p>
+    <w:p>
+      <w:pPr>
+        <w:spacing w:before="0" w:after="160"/>
+        <w:ind w:left="0"/>
+        <w:jc w:val="left"/>
+        <w:rPr>
+          <w:rFonts w:ascii="Times New Roman" w:hAnsi="Times New Roman" w:cs="Times New Roman"/>
+          <w:sz w:val="24"/>
+          <w:szCs w:val="24"/>
+        </w:rPr>
+      </w:pPr>
+      <w:r>
+        <w:rPr>
+          <w:rFonts w:ascii="Times New Roman" w:hAnsi="Times New Roman" w:cs="Times New Roman"/>
+          <w:sz w:val="24"/>
+          <w:szCs w:val="24"/>
+        </w:rPr>
+        <w:t xml:space="preserve">             writeln('Setor tunai berhasil!');</w:t>
+      </w:r>
+    </w:p>
+    <w:p>
+      <w:pPr>
+        <w:spacing w:before="0" w:after="160"/>
+        <w:ind w:left="0"/>
+        <w:jc w:val="left"/>
+        <w:rPr>
+          <w:rFonts w:ascii="Times New Roman" w:hAnsi="Times New Roman" w:cs="Times New Roman"/>
+          <w:sz w:val="24"/>
+          <w:szCs w:val="24"/>
+        </w:rPr>
+      </w:pPr>
+      <w:r>
+        <w:rPr>
+          <w:rFonts w:ascii="Times New Roman" w:hAnsi="Times New Roman" w:cs="Times New Roman"/>
+          <w:sz w:val="24"/>
+          <w:szCs w:val="24"/>
+        </w:rPr>
+        <w:t xml:space="preserve">             StrukTransaksi('Setor Tunai', setor);</w:t>
       </w:r>
     </w:p>
     <w:p>
@@ -3370,25 +2630,7 @@
           <w:sz w:val="24"/>
           <w:szCs w:val="24"/>
         </w:rPr>
-        <w:t xml:space="preserve">           </w:t>
-      </w:r>
-      <w:proofErr w:type="gramStart"/>
-      <w:r>
-        <w:rPr>
-          <w:rFonts w:ascii="Times New Roman" w:hAnsi="Times New Roman" w:cs="Times New Roman"/>
-          <w:sz w:val="24"/>
-          <w:szCs w:val="24"/>
-        </w:rPr>
-        <w:t>write(</w:t>
-      </w:r>
-      <w:proofErr w:type="gramEnd"/>
-      <w:r>
-        <w:rPr>
-          <w:rFonts w:ascii="Times New Roman" w:hAnsi="Times New Roman" w:cs="Times New Roman"/>
-          <w:sz w:val="24"/>
-          <w:szCs w:val="24"/>
-        </w:rPr>
-        <w:t>'Masukkan jumlah transfer: ');</w:t>
+        <w:t xml:space="preserve">           write('Masukkan jumlah transfer: ');</w:t>
       </w:r>
     </w:p>
     <w:p>
@@ -3460,25 +2702,7 @@
           <w:sz w:val="24"/>
           <w:szCs w:val="24"/>
         </w:rPr>
-        <w:t xml:space="preserve">             </w:t>
-      </w:r>
-      <w:proofErr w:type="gramStart"/>
-      <w:r>
-        <w:rPr>
-          <w:rFonts w:ascii="Times New Roman" w:hAnsi="Times New Roman" w:cs="Times New Roman"/>
-          <w:sz w:val="24"/>
-          <w:szCs w:val="24"/>
-        </w:rPr>
-        <w:t>writeln(</w:t>
-      </w:r>
-      <w:proofErr w:type="gramEnd"/>
-      <w:r>
-        <w:rPr>
-          <w:rFonts w:ascii="Times New Roman" w:hAnsi="Times New Roman" w:cs="Times New Roman"/>
-          <w:sz w:val="24"/>
-          <w:szCs w:val="24"/>
-        </w:rPr>
-        <w:t>'Jumlah tidak valid!')</w:t>
+        <w:t xml:space="preserve">             writeln('Jumlah tidak valid!')</w:t>
       </w:r>
     </w:p>
     <w:p>
@@ -3518,25 +2742,7 @@
           <w:sz w:val="24"/>
           <w:szCs w:val="24"/>
         </w:rPr>
-        <w:t xml:space="preserve">             </w:t>
-      </w:r>
-      <w:proofErr w:type="gramStart"/>
-      <w:r>
-        <w:rPr>
-          <w:rFonts w:ascii="Times New Roman" w:hAnsi="Times New Roman" w:cs="Times New Roman"/>
-          <w:sz w:val="24"/>
-          <w:szCs w:val="24"/>
-        </w:rPr>
-        <w:t>writeln(</w:t>
-      </w:r>
-      <w:proofErr w:type="gramEnd"/>
-      <w:r>
-        <w:rPr>
-          <w:rFonts w:ascii="Times New Roman" w:hAnsi="Times New Roman" w:cs="Times New Roman"/>
-          <w:sz w:val="24"/>
-          <w:szCs w:val="24"/>
-        </w:rPr>
-        <w:t>'Saldo tidak cukup!')</w:t>
+        <w:t xml:space="preserve">             writeln('Saldo tidak cukup!')</w:t>
       </w:r>
     </w:p>
     <w:p>
@@ -3597,101 +2803,47 @@
           <w:sz w:val="24"/>
           <w:szCs w:val="24"/>
         </w:rPr>
-        <w:t xml:space="preserve">             </w:t>
-      </w:r>
-      <w:proofErr w:type="gramStart"/>
-      <w:r>
-        <w:rPr>
-          <w:rFonts w:ascii="Times New Roman" w:hAnsi="Times New Roman" w:cs="Times New Roman"/>
-          <w:sz w:val="24"/>
-          <w:szCs w:val="24"/>
-        </w:rPr>
-        <w:t>saldo :</w:t>
-      </w:r>
-      <w:proofErr w:type="gramEnd"/>
-      <w:r>
-        <w:rPr>
-          <w:rFonts w:ascii="Times New Roman" w:hAnsi="Times New Roman" w:cs="Times New Roman"/>
-          <w:sz w:val="24"/>
-          <w:szCs w:val="24"/>
-        </w:rPr>
-        <w:t>= saldo - transfer;</w:t>
-      </w:r>
-    </w:p>
-    <w:p>
-      <w:pPr>
-        <w:spacing w:before="0" w:after="160"/>
-        <w:ind w:left="0"/>
-        <w:jc w:val="left"/>
-        <w:rPr>
-          <w:rFonts w:ascii="Times New Roman" w:hAnsi="Times New Roman" w:cs="Times New Roman"/>
-          <w:sz w:val="24"/>
-          <w:szCs w:val="24"/>
-        </w:rPr>
-      </w:pPr>
-      <w:r>
-        <w:rPr>
-          <w:rFonts w:ascii="Times New Roman" w:hAnsi="Times New Roman" w:cs="Times New Roman"/>
-          <w:sz w:val="24"/>
-          <w:szCs w:val="24"/>
-        </w:rPr>
-        <w:t xml:space="preserve">             </w:t>
-      </w:r>
-      <w:proofErr w:type="gramStart"/>
-      <w:r>
-        <w:rPr>
-          <w:rFonts w:ascii="Times New Roman" w:hAnsi="Times New Roman" w:cs="Times New Roman"/>
-          <w:sz w:val="24"/>
-          <w:szCs w:val="24"/>
-        </w:rPr>
-        <w:t>writeln(</w:t>
-      </w:r>
-      <w:proofErr w:type="gramEnd"/>
-      <w:r>
-        <w:rPr>
-          <w:rFonts w:ascii="Times New Roman" w:hAnsi="Times New Roman" w:cs="Times New Roman"/>
-          <w:sz w:val="24"/>
-          <w:szCs w:val="24"/>
-        </w:rPr>
-        <w:t>'Transfer berhasil!');</w:t>
-      </w:r>
-    </w:p>
-    <w:p>
-      <w:pPr>
-        <w:spacing w:before="0" w:after="160"/>
-        <w:ind w:left="0"/>
-        <w:jc w:val="left"/>
-        <w:rPr>
-          <w:rFonts w:ascii="Times New Roman" w:hAnsi="Times New Roman" w:cs="Times New Roman"/>
-          <w:sz w:val="24"/>
-          <w:szCs w:val="24"/>
-        </w:rPr>
-      </w:pPr>
-      <w:r>
-        <w:rPr>
-          <w:rFonts w:ascii="Times New Roman" w:hAnsi="Times New Roman" w:cs="Times New Roman"/>
-          <w:sz w:val="24"/>
-          <w:szCs w:val="24"/>
-        </w:rPr>
-        <w:t xml:space="preserve">             </w:t>
-      </w:r>
-      <w:proofErr w:type="gramStart"/>
-      <w:r>
-        <w:rPr>
-          <w:rFonts w:ascii="Times New Roman" w:hAnsi="Times New Roman" w:cs="Times New Roman"/>
-          <w:sz w:val="24"/>
-          <w:szCs w:val="24"/>
-        </w:rPr>
-        <w:t>StrukTransaksi(</w:t>
-      </w:r>
-      <w:proofErr w:type="gramEnd"/>
-      <w:r>
-        <w:rPr>
-          <w:rFonts w:ascii="Times New Roman" w:hAnsi="Times New Roman" w:cs="Times New Roman"/>
-          <w:sz w:val="24"/>
-          <w:szCs w:val="24"/>
-        </w:rPr>
-        <w:t>'Transfer', transfer);</w:t>
+        <w:t xml:space="preserve">             saldo := saldo - transfer;</w:t>
+      </w:r>
+    </w:p>
+    <w:p>
+      <w:pPr>
+        <w:spacing w:before="0" w:after="160"/>
+        <w:ind w:left="0"/>
+        <w:jc w:val="left"/>
+        <w:rPr>
+          <w:rFonts w:ascii="Times New Roman" w:hAnsi="Times New Roman" w:cs="Times New Roman"/>
+          <w:sz w:val="24"/>
+          <w:szCs w:val="24"/>
+        </w:rPr>
+      </w:pPr>
+      <w:r>
+        <w:rPr>
+          <w:rFonts w:ascii="Times New Roman" w:hAnsi="Times New Roman" w:cs="Times New Roman"/>
+          <w:sz w:val="24"/>
+          <w:szCs w:val="24"/>
+        </w:rPr>
+        <w:t xml:space="preserve">             writeln('Transfer berhasil!');</w:t>
+      </w:r>
+    </w:p>
+    <w:p>
+      <w:pPr>
+        <w:spacing w:before="0" w:after="160"/>
+        <w:ind w:left="0"/>
+        <w:jc w:val="left"/>
+        <w:rPr>
+          <w:rFonts w:ascii="Times New Roman" w:hAnsi="Times New Roman" w:cs="Times New Roman"/>
+          <w:sz w:val="24"/>
+          <w:szCs w:val="24"/>
+        </w:rPr>
+      </w:pPr>
+      <w:r>
+        <w:rPr>
+          <w:rFonts w:ascii="Times New Roman" w:hAnsi="Times New Roman" w:cs="Times New Roman"/>
+          <w:sz w:val="24"/>
+          <w:szCs w:val="24"/>
+        </w:rPr>
+        <w:t xml:space="preserve">             StrukTransaksi('Transfer', transfer);</w:t>
       </w:r>
     </w:p>
     <w:p>
@@ -3783,25 +2935,7 @@
           <w:sz w:val="24"/>
           <w:szCs w:val="24"/>
         </w:rPr>
-        <w:t xml:space="preserve">           </w:t>
-      </w:r>
-      <w:proofErr w:type="gramStart"/>
-      <w:r>
-        <w:rPr>
-          <w:rFonts w:ascii="Times New Roman" w:hAnsi="Times New Roman" w:cs="Times New Roman"/>
-          <w:sz w:val="24"/>
-          <w:szCs w:val="24"/>
-        </w:rPr>
-        <w:t>write(</w:t>
-      </w:r>
-      <w:proofErr w:type="gramEnd"/>
-      <w:r>
-        <w:rPr>
-          <w:rFonts w:ascii="Times New Roman" w:hAnsi="Times New Roman" w:cs="Times New Roman"/>
-          <w:sz w:val="24"/>
-          <w:szCs w:val="24"/>
-        </w:rPr>
-        <w:t>'Masukkan PIN baru: ');</w:t>
+        <w:t xml:space="preserve">           write('Masukkan PIN baru: ');</w:t>
       </w:r>
     </w:p>
     <w:p>
@@ -3873,25 +3007,7 @@
           <w:sz w:val="24"/>
           <w:szCs w:val="24"/>
         </w:rPr>
-        <w:t xml:space="preserve">             </w:t>
-      </w:r>
-      <w:proofErr w:type="gramStart"/>
-      <w:r>
-        <w:rPr>
-          <w:rFonts w:ascii="Times New Roman" w:hAnsi="Times New Roman" w:cs="Times New Roman"/>
-          <w:sz w:val="24"/>
-          <w:szCs w:val="24"/>
-        </w:rPr>
-        <w:t>writeln(</w:t>
-      </w:r>
-      <w:proofErr w:type="gramEnd"/>
-      <w:r>
-        <w:rPr>
-          <w:rFonts w:ascii="Times New Roman" w:hAnsi="Times New Roman" w:cs="Times New Roman"/>
-          <w:sz w:val="24"/>
-          <w:szCs w:val="24"/>
-        </w:rPr>
-        <w:t>'PIN minimal 4 digit!')</w:t>
+        <w:t xml:space="preserve">             writeln('PIN minimal 4 digit!')</w:t>
       </w:r>
     </w:p>
     <w:p>
@@ -3951,63 +3067,27 @@
           <w:sz w:val="24"/>
           <w:szCs w:val="24"/>
         </w:rPr>
-        <w:t xml:space="preserve">             </w:t>
-      </w:r>
-      <w:proofErr w:type="gramStart"/>
-      <w:r>
-        <w:rPr>
-          <w:rFonts w:ascii="Times New Roman" w:hAnsi="Times New Roman" w:cs="Times New Roman"/>
-          <w:sz w:val="24"/>
-          <w:szCs w:val="24"/>
-        </w:rPr>
-        <w:t>pin :</w:t>
-      </w:r>
-      <w:proofErr w:type="gramEnd"/>
-      <w:r>
-        <w:rPr>
-          <w:rFonts w:ascii="Times New Roman" w:hAnsi="Times New Roman" w:cs="Times New Roman"/>
-          <w:sz w:val="24"/>
-          <w:szCs w:val="24"/>
-        </w:rPr>
-        <w:t>= pinBaru;</w:t>
-      </w:r>
-    </w:p>
-    <w:p>
-      <w:pPr>
-        <w:spacing w:before="0" w:after="160"/>
-        <w:ind w:left="0"/>
-        <w:jc w:val="left"/>
-        <w:rPr>
-          <w:rFonts w:ascii="Times New Roman" w:hAnsi="Times New Roman" w:cs="Times New Roman"/>
-          <w:sz w:val="24"/>
-          <w:szCs w:val="24"/>
-        </w:rPr>
-      </w:pPr>
-      <w:r>
-        <w:rPr>
-          <w:rFonts w:ascii="Times New Roman" w:hAnsi="Times New Roman" w:cs="Times New Roman"/>
-          <w:sz w:val="24"/>
-          <w:szCs w:val="24"/>
-        </w:rPr>
-        <w:t xml:space="preserve">             </w:t>
-      </w:r>
-      <w:proofErr w:type="gramStart"/>
-      <w:r>
-        <w:rPr>
-          <w:rFonts w:ascii="Times New Roman" w:hAnsi="Times New Roman" w:cs="Times New Roman"/>
-          <w:sz w:val="24"/>
-          <w:szCs w:val="24"/>
-        </w:rPr>
-        <w:t>writeln(</w:t>
-      </w:r>
-      <w:proofErr w:type="gramEnd"/>
-      <w:r>
-        <w:rPr>
-          <w:rFonts w:ascii="Times New Roman" w:hAnsi="Times New Roman" w:cs="Times New Roman"/>
-          <w:sz w:val="24"/>
-          <w:szCs w:val="24"/>
-        </w:rPr>
-        <w:t>'PIN berhasil diganti!');</w:t>
+        <w:t xml:space="preserve">             pin := pinBaru;</w:t>
+      </w:r>
+    </w:p>
+    <w:p>
+      <w:pPr>
+        <w:spacing w:before="0" w:after="160"/>
+        <w:ind w:left="0"/>
+        <w:jc w:val="left"/>
+        <w:rPr>
+          <w:rFonts w:ascii="Times New Roman" w:hAnsi="Times New Roman" w:cs="Times New Roman"/>
+          <w:sz w:val="24"/>
+          <w:szCs w:val="24"/>
+        </w:rPr>
+      </w:pPr>
+      <w:r>
+        <w:rPr>
+          <w:rFonts w:ascii="Times New Roman" w:hAnsi="Times New Roman" w:cs="Times New Roman"/>
+          <w:sz w:val="24"/>
+          <w:szCs w:val="24"/>
+        </w:rPr>
+        <w:t xml:space="preserve">             writeln('PIN berhasil diganti!');</w:t>
       </w:r>
     </w:p>
     <w:p>
@@ -4099,25 +3179,7 @@
           <w:sz w:val="24"/>
           <w:szCs w:val="24"/>
         </w:rPr>
-        <w:t xml:space="preserve">           </w:t>
-      </w:r>
-      <w:proofErr w:type="gramStart"/>
-      <w:r>
-        <w:rPr>
-          <w:rFonts w:ascii="Times New Roman" w:hAnsi="Times New Roman" w:cs="Times New Roman"/>
-          <w:sz w:val="24"/>
-          <w:szCs w:val="24"/>
-        </w:rPr>
-        <w:t>writeln(</w:t>
-      </w:r>
-      <w:proofErr w:type="gramEnd"/>
-      <w:r>
-        <w:rPr>
-          <w:rFonts w:ascii="Times New Roman" w:hAnsi="Times New Roman" w:cs="Times New Roman"/>
-          <w:sz w:val="24"/>
-          <w:szCs w:val="24"/>
-        </w:rPr>
-        <w:t>'Terima kasih telah menggunakan ATM.');</w:t>
+        <w:t xml:space="preserve">           writeln('Terima kasih telah menggunakan ATM.');</w:t>
       </w:r>
     </w:p>
     <w:p>
@@ -4262,25 +3324,7 @@
           <w:sz w:val="24"/>
           <w:szCs w:val="24"/>
         </w:rPr>
-        <w:t xml:space="preserve">      </w:t>
-      </w:r>
-      <w:proofErr w:type="gramStart"/>
-      <w:r>
-        <w:rPr>
-          <w:rFonts w:ascii="Times New Roman" w:hAnsi="Times New Roman" w:cs="Times New Roman"/>
-          <w:sz w:val="24"/>
-          <w:szCs w:val="24"/>
-        </w:rPr>
-        <w:t>writeln(</w:t>
-      </w:r>
-      <w:proofErr w:type="gramEnd"/>
-      <w:r>
-        <w:rPr>
-          <w:rFonts w:ascii="Times New Roman" w:hAnsi="Times New Roman" w:cs="Times New Roman"/>
-          <w:sz w:val="24"/>
-          <w:szCs w:val="24"/>
-        </w:rPr>
-        <w:t>'Tekan ENTER untuk kembali ke menu...');</w:t>
+        <w:t xml:space="preserve">      writeln('Tekan ENTER untuk kembali ke menu...');</w:t>
       </w:r>
     </w:p>
     <w:p>

</xml_diff>